<commit_message>
Rebuild horn assembly diagrams and editable instructions
</commit_message>
<xml_diff>
--- a/assets/lessons/horn-construction/horn-and-can-assembly-2021.docx
+++ b/assets/lessons/horn-construction/horn-and-can-assembly-2021.docx
@@ -551,13 +551,473 @@
     </w:p>
     <w:p>
       <w:r>
-        <w:t>Cut two large panels and two small panels using the layout in Figure 2. Keep the shorter edges accurate so they fit the can opening.</w:t>
+        <w:t>Cut two large panels and two small panels from foil-faced insulation board. Their short edges form the opening around the can.</w:t>
       </w:r>
     </w:p>
+    <w:tbl>
+      <w:tblPr>
+        <w:tblStyle w:val="TableGrid"/>
+        <w:tblW w:w="0" w:type="auto"/>
+        <w:jc w:val="center"/>
+        <w:tblLayout w:type="fixed"/>
+        <w:tblLook w:val="04A0" w:firstRow="1" w:lastRow="0" w:firstColumn="1" w:lastColumn="0" w:noHBand="0" w:noVBand="1"/>
+      </w:tblPr>
+      <w:tblGrid>
+        <w:gridCol w:w="1440"/>
+        <w:gridCol w:w="1152"/>
+        <w:gridCol w:w="2592"/>
+        <w:gridCol w:w="2448"/>
+        <w:gridCol w:w="2448"/>
+      </w:tblGrid>
+      <w:tr>
+        <w:trPr>
+          <w:cantSplit/>
+          <w:tblHeader/>
+          <w:jc w:val="center"/>
+        </w:trPr>
+        <w:tc>
+          <w:tcPr>
+            <w:tcW w:w="1440" w:type="dxa"/>
+            <w:tcBorders>
+              <w:top w:val="single" w:sz="4" w:space="0" w:color="D9D9D9"/>
+              <w:left w:val="single" w:sz="4" w:space="0" w:color="D9D9D9"/>
+              <w:bottom w:val="single" w:sz="4" w:space="0" w:color="D9D9D9"/>
+              <w:right w:val="single" w:sz="4" w:space="0" w:color="D9D9D9"/>
+            </w:tcBorders>
+            <w:shd w:val="clear" w:color="auto" w:fill="002855"/>
+            <w:tcMar>
+              <w:top w:w="70" w:type="dxa"/>
+              <w:left w:w="90" w:type="dxa"/>
+              <w:bottom w:w="70" w:type="dxa"/>
+              <w:right w:w="90" w:type="dxa"/>
+            </w:tcMar>
+            <w:vAlign w:val="center"/>
+          </w:tcPr>
+          <w:p>
+            <w:pPr>
+              <w:spacing w:after="0"/>
+            </w:pPr>
+            <w:r>
+              <w:rPr>
+                <w:b/>
+                <w:color w:val="FFFFFF"/>
+              </w:rPr>
+              <w:t>Panel</w:t>
+            </w:r>
+          </w:p>
+        </w:tc>
+        <w:tc>
+          <w:tcPr>
+            <w:tcW w:w="1152" w:type="dxa"/>
+            <w:tcBorders>
+              <w:top w:val="single" w:sz="4" w:space="0" w:color="D9D9D9"/>
+              <w:left w:val="single" w:sz="4" w:space="0" w:color="D9D9D9"/>
+              <w:bottom w:val="single" w:sz="4" w:space="0" w:color="D9D9D9"/>
+              <w:right w:val="single" w:sz="4" w:space="0" w:color="D9D9D9"/>
+            </w:tcBorders>
+            <w:shd w:val="clear" w:color="auto" w:fill="002855"/>
+            <w:tcMar>
+              <w:top w:w="70" w:type="dxa"/>
+              <w:left w:w="90" w:type="dxa"/>
+              <w:bottom w:w="70" w:type="dxa"/>
+              <w:right w:w="90" w:type="dxa"/>
+            </w:tcMar>
+            <w:vAlign w:val="center"/>
+          </w:tcPr>
+          <w:p>
+            <w:pPr>
+              <w:spacing w:after="0"/>
+            </w:pPr>
+            <w:r>
+              <w:rPr>
+                <w:b/>
+                <w:color w:val="FFFFFF"/>
+              </w:rPr>
+              <w:t>Quantity</w:t>
+            </w:r>
+          </w:p>
+        </w:tc>
+        <w:tc>
+          <w:tcPr>
+            <w:tcW w:w="2592" w:type="dxa"/>
+            <w:tcBorders>
+              <w:top w:val="single" w:sz="4" w:space="0" w:color="D9D9D9"/>
+              <w:left w:val="single" w:sz="4" w:space="0" w:color="D9D9D9"/>
+              <w:bottom w:val="single" w:sz="4" w:space="0" w:color="D9D9D9"/>
+              <w:right w:val="single" w:sz="4" w:space="0" w:color="D9D9D9"/>
+            </w:tcBorders>
+            <w:shd w:val="clear" w:color="auto" w:fill="002855"/>
+            <w:tcMar>
+              <w:top w:w="70" w:type="dxa"/>
+              <w:left w:w="90" w:type="dxa"/>
+              <w:bottom w:w="70" w:type="dxa"/>
+              <w:right w:w="90" w:type="dxa"/>
+            </w:tcMar>
+            <w:vAlign w:val="center"/>
+          </w:tcPr>
+          <w:p>
+            <w:pPr>
+              <w:spacing w:after="0"/>
+            </w:pPr>
+            <w:r>
+              <w:rPr>
+                <w:b/>
+                <w:color w:val="FFFFFF"/>
+              </w:rPr>
+              <w:t>Wide edge</w:t>
+            </w:r>
+          </w:p>
+        </w:tc>
+        <w:tc>
+          <w:tcPr>
+            <w:tcW w:w="2448" w:type="dxa"/>
+            <w:tcBorders>
+              <w:top w:val="single" w:sz="4" w:space="0" w:color="D9D9D9"/>
+              <w:left w:val="single" w:sz="4" w:space="0" w:color="D9D9D9"/>
+              <w:bottom w:val="single" w:sz="4" w:space="0" w:color="D9D9D9"/>
+              <w:right w:val="single" w:sz="4" w:space="0" w:color="D9D9D9"/>
+            </w:tcBorders>
+            <w:shd w:val="clear" w:color="auto" w:fill="002855"/>
+            <w:tcMar>
+              <w:top w:w="70" w:type="dxa"/>
+              <w:left w:w="90" w:type="dxa"/>
+              <w:bottom w:w="70" w:type="dxa"/>
+              <w:right w:w="90" w:type="dxa"/>
+            </w:tcMar>
+            <w:vAlign w:val="center"/>
+          </w:tcPr>
+          <w:p>
+            <w:pPr>
+              <w:spacing w:after="0"/>
+            </w:pPr>
+            <w:r>
+              <w:rPr>
+                <w:b/>
+                <w:color w:val="FFFFFF"/>
+              </w:rPr>
+              <w:t>Short edge</w:t>
+            </w:r>
+          </w:p>
+        </w:tc>
+        <w:tc>
+          <w:tcPr>
+            <w:tcW w:w="2448" w:type="dxa"/>
+            <w:tcBorders>
+              <w:top w:val="single" w:sz="4" w:space="0" w:color="D9D9D9"/>
+              <w:left w:val="single" w:sz="4" w:space="0" w:color="D9D9D9"/>
+              <w:bottom w:val="single" w:sz="4" w:space="0" w:color="D9D9D9"/>
+              <w:right w:val="single" w:sz="4" w:space="0" w:color="D9D9D9"/>
+            </w:tcBorders>
+            <w:shd w:val="clear" w:color="auto" w:fill="002855"/>
+            <w:tcMar>
+              <w:top w:w="70" w:type="dxa"/>
+              <w:left w:w="90" w:type="dxa"/>
+              <w:bottom w:w="70" w:type="dxa"/>
+              <w:right w:w="90" w:type="dxa"/>
+            </w:tcMar>
+            <w:vAlign w:val="center"/>
+          </w:tcPr>
+          <w:p>
+            <w:pPr>
+              <w:spacing w:after="0"/>
+            </w:pPr>
+            <w:r>
+              <w:rPr>
+                <w:b/>
+                <w:color w:val="FFFFFF"/>
+              </w:rPr>
+              <w:t>Height</w:t>
+            </w:r>
+          </w:p>
+        </w:tc>
+      </w:tr>
+      <w:tr>
+        <w:trPr>
+          <w:cantSplit/>
+          <w:jc w:val="center"/>
+        </w:trPr>
+        <w:tc>
+          <w:tcPr>
+            <w:tcW w:w="1440" w:type="dxa"/>
+            <w:tcBorders>
+              <w:top w:val="single" w:sz="4" w:space="0" w:color="D9D9D9"/>
+              <w:left w:val="single" w:sz="4" w:space="0" w:color="D9D9D9"/>
+              <w:bottom w:val="single" w:sz="4" w:space="0" w:color="D9D9D9"/>
+              <w:right w:val="single" w:sz="4" w:space="0" w:color="D9D9D9"/>
+            </w:tcBorders>
+            <w:shd w:val="clear" w:color="auto" w:fill="F3F5F7"/>
+            <w:tcMar>
+              <w:top w:w="70" w:type="dxa"/>
+              <w:left w:w="90" w:type="dxa"/>
+              <w:bottom w:w="70" w:type="dxa"/>
+              <w:right w:w="90" w:type="dxa"/>
+            </w:tcMar>
+            <w:vAlign w:val="center"/>
+          </w:tcPr>
+          <w:p>
+            <w:pPr>
+              <w:spacing w:after="0"/>
+            </w:pPr>
+            <w:r>
+              <w:t>Large</w:t>
+            </w:r>
+          </w:p>
+        </w:tc>
+        <w:tc>
+          <w:tcPr>
+            <w:tcW w:w="1152" w:type="dxa"/>
+            <w:tcBorders>
+              <w:top w:val="single" w:sz="4" w:space="0" w:color="D9D9D9"/>
+              <w:left w:val="single" w:sz="4" w:space="0" w:color="D9D9D9"/>
+              <w:bottom w:val="single" w:sz="4" w:space="0" w:color="D9D9D9"/>
+              <w:right w:val="single" w:sz="4" w:space="0" w:color="D9D9D9"/>
+            </w:tcBorders>
+            <w:shd w:val="clear" w:color="auto" w:fill="F3F5F7"/>
+            <w:tcMar>
+              <w:top w:w="70" w:type="dxa"/>
+              <w:left w:w="90" w:type="dxa"/>
+              <w:bottom w:w="70" w:type="dxa"/>
+              <w:right w:w="90" w:type="dxa"/>
+            </w:tcMar>
+            <w:vAlign w:val="center"/>
+          </w:tcPr>
+          <w:p>
+            <w:pPr>
+              <w:spacing w:after="0"/>
+            </w:pPr>
+            <w:r>
+              <w:t>2</w:t>
+            </w:r>
+          </w:p>
+        </w:tc>
+        <w:tc>
+          <w:tcPr>
+            <w:tcW w:w="2592" w:type="dxa"/>
+            <w:tcBorders>
+              <w:top w:val="single" w:sz="4" w:space="0" w:color="D9D9D9"/>
+              <w:left w:val="single" w:sz="4" w:space="0" w:color="D9D9D9"/>
+              <w:bottom w:val="single" w:sz="4" w:space="0" w:color="D9D9D9"/>
+              <w:right w:val="single" w:sz="4" w:space="0" w:color="D9D9D9"/>
+            </w:tcBorders>
+            <w:shd w:val="clear" w:color="auto" w:fill="F3F5F7"/>
+            <w:tcMar>
+              <w:top w:w="70" w:type="dxa"/>
+              <w:left w:w="90" w:type="dxa"/>
+              <w:bottom w:w="70" w:type="dxa"/>
+              <w:right w:w="90" w:type="dxa"/>
+            </w:tcMar>
+            <w:vAlign w:val="center"/>
+          </w:tcPr>
+          <w:p>
+            <w:pPr>
+              <w:spacing w:after="0"/>
+            </w:pPr>
+            <w:r>
+              <w:t>29 5/8 in</w:t>
+            </w:r>
+          </w:p>
+        </w:tc>
+        <w:tc>
+          <w:tcPr>
+            <w:tcW w:w="2448" w:type="dxa"/>
+            <w:tcBorders>
+              <w:top w:val="single" w:sz="4" w:space="0" w:color="D9D9D9"/>
+              <w:left w:val="single" w:sz="4" w:space="0" w:color="D9D9D9"/>
+              <w:bottom w:val="single" w:sz="4" w:space="0" w:color="D9D9D9"/>
+              <w:right w:val="single" w:sz="4" w:space="0" w:color="D9D9D9"/>
+            </w:tcBorders>
+            <w:shd w:val="clear" w:color="auto" w:fill="F3F5F7"/>
+            <w:tcMar>
+              <w:top w:w="70" w:type="dxa"/>
+              <w:left w:w="90" w:type="dxa"/>
+              <w:bottom w:w="70" w:type="dxa"/>
+              <w:right w:w="90" w:type="dxa"/>
+            </w:tcMar>
+            <w:vAlign w:val="center"/>
+          </w:tcPr>
+          <w:p>
+            <w:pPr>
+              <w:spacing w:after="0"/>
+            </w:pPr>
+            <w:r>
+              <w:t>6 5/8 in</w:t>
+            </w:r>
+          </w:p>
+        </w:tc>
+        <w:tc>
+          <w:tcPr>
+            <w:tcW w:w="2448" w:type="dxa"/>
+            <w:tcBorders>
+              <w:top w:val="single" w:sz="4" w:space="0" w:color="D9D9D9"/>
+              <w:left w:val="single" w:sz="4" w:space="0" w:color="D9D9D9"/>
+              <w:bottom w:val="single" w:sz="4" w:space="0" w:color="D9D9D9"/>
+              <w:right w:val="single" w:sz="4" w:space="0" w:color="D9D9D9"/>
+            </w:tcBorders>
+            <w:shd w:val="clear" w:color="auto" w:fill="F3F5F7"/>
+            <w:tcMar>
+              <w:top w:w="70" w:type="dxa"/>
+              <w:left w:w="90" w:type="dxa"/>
+              <w:bottom w:w="70" w:type="dxa"/>
+              <w:right w:w="90" w:type="dxa"/>
+            </w:tcMar>
+            <w:vAlign w:val="center"/>
+          </w:tcPr>
+          <w:p>
+            <w:pPr>
+              <w:spacing w:after="0"/>
+            </w:pPr>
+            <w:r>
+              <w:t>28 3/4 in</w:t>
+            </w:r>
+          </w:p>
+        </w:tc>
+      </w:tr>
+      <w:tr>
+        <w:trPr>
+          <w:cantSplit/>
+          <w:jc w:val="center"/>
+        </w:trPr>
+        <w:tc>
+          <w:tcPr>
+            <w:tcW w:w="1440" w:type="dxa"/>
+            <w:tcBorders>
+              <w:top w:val="single" w:sz="4" w:space="0" w:color="D9D9D9"/>
+              <w:left w:val="single" w:sz="4" w:space="0" w:color="D9D9D9"/>
+              <w:bottom w:val="single" w:sz="4" w:space="0" w:color="D9D9D9"/>
+              <w:right w:val="single" w:sz="4" w:space="0" w:color="D9D9D9"/>
+            </w:tcBorders>
+            <w:shd w:val="clear" w:color="auto" w:fill="FFFFFF"/>
+            <w:tcMar>
+              <w:top w:w="70" w:type="dxa"/>
+              <w:left w:w="90" w:type="dxa"/>
+              <w:bottom w:w="70" w:type="dxa"/>
+              <w:right w:w="90" w:type="dxa"/>
+            </w:tcMar>
+            <w:vAlign w:val="center"/>
+          </w:tcPr>
+          <w:p>
+            <w:pPr>
+              <w:spacing w:after="0"/>
+            </w:pPr>
+            <w:r>
+              <w:t>Small</w:t>
+            </w:r>
+          </w:p>
+        </w:tc>
+        <w:tc>
+          <w:tcPr>
+            <w:tcW w:w="1152" w:type="dxa"/>
+            <w:tcBorders>
+              <w:top w:val="single" w:sz="4" w:space="0" w:color="D9D9D9"/>
+              <w:left w:val="single" w:sz="4" w:space="0" w:color="D9D9D9"/>
+              <w:bottom w:val="single" w:sz="4" w:space="0" w:color="D9D9D9"/>
+              <w:right w:val="single" w:sz="4" w:space="0" w:color="D9D9D9"/>
+            </w:tcBorders>
+            <w:shd w:val="clear" w:color="auto" w:fill="FFFFFF"/>
+            <w:tcMar>
+              <w:top w:w="70" w:type="dxa"/>
+              <w:left w:w="90" w:type="dxa"/>
+              <w:bottom w:w="70" w:type="dxa"/>
+              <w:right w:w="90" w:type="dxa"/>
+            </w:tcMar>
+            <w:vAlign w:val="center"/>
+          </w:tcPr>
+          <w:p>
+            <w:pPr>
+              <w:spacing w:after="0"/>
+            </w:pPr>
+            <w:r>
+              <w:t>2</w:t>
+            </w:r>
+          </w:p>
+        </w:tc>
+        <w:tc>
+          <w:tcPr>
+            <w:tcW w:w="2592" w:type="dxa"/>
+            <w:tcBorders>
+              <w:top w:val="single" w:sz="4" w:space="0" w:color="D9D9D9"/>
+              <w:left w:val="single" w:sz="4" w:space="0" w:color="D9D9D9"/>
+              <w:bottom w:val="single" w:sz="4" w:space="0" w:color="D9D9D9"/>
+              <w:right w:val="single" w:sz="4" w:space="0" w:color="D9D9D9"/>
+            </w:tcBorders>
+            <w:shd w:val="clear" w:color="auto" w:fill="FFFFFF"/>
+            <w:tcMar>
+              <w:top w:w="70" w:type="dxa"/>
+              <w:left w:w="90" w:type="dxa"/>
+              <w:bottom w:w="70" w:type="dxa"/>
+              <w:right w:w="90" w:type="dxa"/>
+            </w:tcMar>
+            <w:vAlign w:val="center"/>
+          </w:tcPr>
+          <w:p>
+            <w:pPr>
+              <w:spacing w:after="0"/>
+            </w:pPr>
+            <w:r>
+              <w:t>24 in</w:t>
+            </w:r>
+          </w:p>
+        </w:tc>
+        <w:tc>
+          <w:tcPr>
+            <w:tcW w:w="2448" w:type="dxa"/>
+            <w:tcBorders>
+              <w:top w:val="single" w:sz="4" w:space="0" w:color="D9D9D9"/>
+              <w:left w:val="single" w:sz="4" w:space="0" w:color="D9D9D9"/>
+              <w:bottom w:val="single" w:sz="4" w:space="0" w:color="D9D9D9"/>
+              <w:right w:val="single" w:sz="4" w:space="0" w:color="D9D9D9"/>
+            </w:tcBorders>
+            <w:shd w:val="clear" w:color="auto" w:fill="FFFFFF"/>
+            <w:tcMar>
+              <w:top w:w="70" w:type="dxa"/>
+              <w:left w:w="90" w:type="dxa"/>
+              <w:bottom w:w="70" w:type="dxa"/>
+              <w:right w:w="90" w:type="dxa"/>
+            </w:tcMar>
+            <w:vAlign w:val="center"/>
+          </w:tcPr>
+          <w:p>
+            <w:pPr>
+              <w:spacing w:after="0"/>
+            </w:pPr>
+            <w:r>
+              <w:t>4 1/8 in</w:t>
+            </w:r>
+          </w:p>
+        </w:tc>
+        <w:tc>
+          <w:tcPr>
+            <w:tcW w:w="2448" w:type="dxa"/>
+            <w:tcBorders>
+              <w:top w:val="single" w:sz="4" w:space="0" w:color="D9D9D9"/>
+              <w:left w:val="single" w:sz="4" w:space="0" w:color="D9D9D9"/>
+              <w:bottom w:val="single" w:sz="4" w:space="0" w:color="D9D9D9"/>
+              <w:right w:val="single" w:sz="4" w:space="0" w:color="D9D9D9"/>
+            </w:tcBorders>
+            <w:shd w:val="clear" w:color="auto" w:fill="FFFFFF"/>
+            <w:tcMar>
+              <w:top w:w="70" w:type="dxa"/>
+              <w:left w:w="90" w:type="dxa"/>
+              <w:bottom w:w="70" w:type="dxa"/>
+              <w:right w:w="90" w:type="dxa"/>
+            </w:tcMar>
+            <w:vAlign w:val="center"/>
+          </w:tcPr>
+          <w:p>
+            <w:pPr>
+              <w:spacing w:after="0"/>
+            </w:pPr>
+            <w:r>
+              <w:t>29 3/8 in</w:t>
+            </w:r>
+          </w:p>
+        </w:tc>
+      </w:tr>
+    </w:tbl>
     <w:p>
       <w:pPr>
         <w:keepNext/>
-        <w:spacing w:before="80" w:after="60"/>
+        <w:spacing w:after="60"/>
         <w:jc w:val="center"/>
       </w:pPr>
       <w:r>
@@ -565,10 +1025,10 @@
           <w:noProof/>
         </w:rPr>
         <w:drawing>
-          <wp:inline distT="0" distB="0" distL="0" distR="0" wp14:anchorId="715A13AC" wp14:editId="27B1A153">
-            <wp:extent cx="4823280" cy="5303520"/>
+          <wp:inline distT="0" distB="0" distL="0" distR="0" wp14:anchorId="4A74D266" wp14:editId="7EB86373">
+            <wp:extent cx="6400800" cy="2939627"/>
             <wp:effectExtent l="0" t="0" r="0" b="0"/>
-            <wp:docPr id="2" name="Picture 2" descr="Figure 2. Panel dimensions and cutting layout for a 4 × 8-foot sheet."/>
+            <wp:docPr id="1279619663" name="Picture 1279619663" descr="Figure 2. Dimensions of the two panel shapes. Heights are perpendicular to the parallel edges."/>
             <wp:cNvGraphicFramePr>
               <a:graphicFrameLocks xmlns:a="http://schemas.openxmlformats.org/drawingml/2006/main" noChangeAspect="1"/>
             </wp:cNvGraphicFramePr>
@@ -576,7 +1036,7 @@
               <a:graphicData uri="http://schemas.openxmlformats.org/drawingml/2006/picture">
                 <pic:pic xmlns:pic="http://schemas.openxmlformats.org/drawingml/2006/picture">
                   <pic:nvPicPr>
-                    <pic:cNvPr id="0" name="image1.png"/>
+                    <pic:cNvPr id="0" name="panel-dimensions.png"/>
                     <pic:cNvPicPr/>
                   </pic:nvPicPr>
                   <pic:blipFill>
@@ -588,7 +1048,7 @@
                   <pic:spPr>
                     <a:xfrm>
                       <a:off x="0" y="0"/>
-                      <a:ext cx="4823280" cy="5303520"/>
+                      <a:ext cx="6400800" cy="2939627"/>
                     </a:xfrm>
                     <a:prstGeom prst="rect">
                       <a:avLst/>
@@ -607,7 +1067,80 @@
         <w:jc w:val="center"/>
       </w:pPr>
       <w:r>
-        <w:t>Figure 2. Panel dimensions and cutting layout for a 4 × 8-foot sheet.</w:t>
+        <w:t>Figure 2. Dimensions of the two panel shapes. Heights are perpendicular to the parallel edges.</w:t>
+      </w:r>
+    </w:p>
+    <w:p>
+      <w:pPr>
+        <w:pStyle w:val="Heading1"/>
+      </w:pPr>
+      <w:r>
+        <w:t>Plan the cuts</w:t>
+      </w:r>
+    </w:p>
+    <w:p>
+      <w:pPr>
+        <w:pStyle w:val="ListNumber"/>
+        <w:numPr>
+          <w:ilvl w:val="0"/>
+          <w:numId w:val="12"/>
+        </w:numPr>
+      </w:pPr>
+      <w:r>
+        <w:t>Have the hardware store cut the sheet into three 32-inch strips for easier transport, if needed.</w:t>
+      </w:r>
+    </w:p>
+    <w:p>
+      <w:pPr>
+        <w:pStyle w:val="ListNumber"/>
+        <w:numPr>
+          <w:ilvl w:val="0"/>
+          <w:numId w:val="12"/>
+        </w:numPr>
+      </w:pPr>
+      <w:r>
+        <w:t>Use the layout on the next page. Cut the two large panels together, then the two small panels.</w:t>
+      </w:r>
+    </w:p>
+    <w:p>
+      <w:pPr>
+        <w:pStyle w:val="ListNumber"/>
+        <w:numPr>
+          <w:ilvl w:val="0"/>
+          <w:numId w:val="12"/>
+        </w:numPr>
+      </w:pPr>
+      <w:r>
+        <w:t>Measure every position from the same side of the sheet. The layout uses the left edge.</w:t>
+      </w:r>
+    </w:p>
+    <w:p>
+      <w:pPr>
+        <w:pStyle w:val="ListNumber"/>
+        <w:numPr>
+          <w:ilvl w:val="0"/>
+          <w:numId w:val="12"/>
+        </w:numPr>
+      </w:pPr>
+      <w:r>
+        <w:t>Check the short edges carefully. These edges must fit the can opening.</w:t>
+      </w:r>
+    </w:p>
+    <w:p>
+      <w:pPr>
+        <w:pStyle w:val="ListNumber"/>
+        <w:numPr>
+          <w:ilvl w:val="0"/>
+          <w:numId w:val="12"/>
+        </w:numPr>
+      </w:pPr>
+      <w:r>
+        <w:t>Keep the remaining strip for spare panels. Fitting one large and one small panel together takes more care.</w:t>
+      </w:r>
+    </w:p>
+    <w:p>
+      <w:r>
+        <w:t>Each large panel narrows by 11 1/2 inches on each side. Each small panel narrows by 9 15/16 inches.</w:t>
       </w:r>
     </w:p>
     <w:p>
@@ -617,23 +1150,18 @@
       </w:pPr>
       <w:r>
         <w:lastRenderedPageBreak/>
-        <w:t>Join the horn panels</w:t>
+        <w:t>Arrange the panels on the sheet</w:t>
       </w:r>
     </w:p>
     <w:p>
       <w:r>
-        <w:t>Lay the panels flat with their foil faces upward. Alternate large and small panels, matching the short edges carefully.</w:t>
-      </w:r>
-    </w:p>
-    <w:p>
-      <w:r>
-        <w:t>Tape the adjoining edges with foil tape. Fold the panels into a horn, keeping the foil faces inside. Tape the remaining seam, then seal the top and bottom edges.</w:t>
+        <w:t>The first two strips supply one horn. The third strip can supply a spare large panel and a spare small panel.</w:t>
       </w:r>
     </w:p>
     <w:p>
       <w:pPr>
         <w:keepNext/>
-        <w:spacing w:before="80" w:after="60"/>
+        <w:spacing w:after="60"/>
         <w:jc w:val="center"/>
       </w:pPr>
       <w:r>
@@ -641,10 +1169,10 @@
           <w:noProof/>
         </w:rPr>
         <w:drawing>
-          <wp:inline distT="0" distB="0" distL="0" distR="0" wp14:anchorId="6486C019" wp14:editId="20845BD8">
-            <wp:extent cx="4425409" cy="4983480"/>
+          <wp:inline distT="0" distB="0" distL="0" distR="0" wp14:anchorId="02CC2F2A" wp14:editId="6E39FF73">
+            <wp:extent cx="4399095" cy="5760720"/>
             <wp:effectExtent l="0" t="0" r="0" b="0"/>
-            <wp:docPr id="3" name="Picture 3" descr="Figure 3. Panel order and seam taping before folding the horn."/>
+            <wp:docPr id="2" name="Picture 2" descr="Figure 3. L marks large panels; S marks small panels. Unlabeled areas are scrap."/>
             <wp:cNvGraphicFramePr>
               <a:graphicFrameLocks xmlns:a="http://schemas.openxmlformats.org/drawingml/2006/main" noChangeAspect="1"/>
             </wp:cNvGraphicFramePr>
@@ -652,7 +1180,7 @@
               <a:graphicData uri="http://schemas.openxmlformats.org/drawingml/2006/picture">
                 <pic:pic xmlns:pic="http://schemas.openxmlformats.org/drawingml/2006/picture">
                   <pic:nvPicPr>
-                    <pic:cNvPr id="0" name="image2.png"/>
+                    <pic:cNvPr id="0" name="sheet-layout.png"/>
                     <pic:cNvPicPr/>
                   </pic:nvPicPr>
                   <pic:blipFill>
@@ -664,7 +1192,7 @@
                   <pic:spPr>
                     <a:xfrm>
                       <a:off x="0" y="0"/>
-                      <a:ext cx="4425409" cy="4983480"/>
+                      <a:ext cx="4399095" cy="5760720"/>
                     </a:xfrm>
                     <a:prstGeom prst="rect">
                       <a:avLst/>
@@ -683,7 +1211,150 @@
         <w:jc w:val="center"/>
       </w:pPr>
       <w:r>
-        <w:t>Figure 3. Panel order and seam taping before folding the horn.</w:t>
+        <w:t>Figure 3. L marks large panels; S marks small panels. Unlabeled areas are scrap.</w:t>
+      </w:r>
+    </w:p>
+    <w:p>
+      <w:r>
+        <w:t>The upper pair leaves 1/4 inch at the right edge. Use the dimensions on the preceding page, not the drawing scale.</w:t>
+      </w:r>
+    </w:p>
+    <w:p>
+      <w:pPr>
+        <w:pStyle w:val="Heading1"/>
+        <w:pageBreakBefore/>
+      </w:pPr>
+      <w:r>
+        <w:lastRenderedPageBreak/>
+        <w:t>Join the horn panels</w:t>
+      </w:r>
+    </w:p>
+    <w:p>
+      <w:pPr>
+        <w:pStyle w:val="ListNumber"/>
+        <w:numPr>
+          <w:ilvl w:val="0"/>
+          <w:numId w:val="13"/>
+        </w:numPr>
+      </w:pPr>
+      <w:r>
+        <w:t>Lay the panels flat with their foil faces upward. Alternate large and small panels as shown below.</w:t>
+      </w:r>
+    </w:p>
+    <w:p>
+      <w:pPr>
+        <w:pStyle w:val="ListNumber"/>
+        <w:numPr>
+          <w:ilvl w:val="0"/>
+          <w:numId w:val="13"/>
+        </w:numPr>
+      </w:pPr>
+      <w:r>
+        <w:t>Align the short edges carefully. The short edges will meet the can.</w:t>
+      </w:r>
+    </w:p>
+    <w:p>
+      <w:pPr>
+        <w:pStyle w:val="ListNumber"/>
+        <w:numPr>
+          <w:ilvl w:val="0"/>
+          <w:numId w:val="13"/>
+        </w:numPr>
+      </w:pPr>
+      <w:r>
+        <w:t>Cut foil tape to the seam length, plus about 1/2 inch. Peel back enough paper to anchor one end.</w:t>
+      </w:r>
+    </w:p>
+    <w:p>
+      <w:pPr>
+        <w:pStyle w:val="ListNumber"/>
+        <w:numPr>
+          <w:ilvl w:val="0"/>
+          <w:numId w:val="13"/>
+        </w:numPr>
+      </w:pPr>
+      <w:r>
+        <w:t>Have one person pull the tape taut and peel away the paper. A second person presses the tape along the seam.</w:t>
+      </w:r>
+    </w:p>
+    <w:p>
+      <w:pPr>
+        <w:pStyle w:val="ListNumber"/>
+        <w:numPr>
+          <w:ilvl w:val="0"/>
+          <w:numId w:val="13"/>
+        </w:numPr>
+      </w:pPr>
+      <w:r>
+        <w:t>Fold the panels into a horn with the foil faces inside. Tape the remaining seam.</w:t>
+      </w:r>
+    </w:p>
+    <w:p>
+      <w:pPr>
+        <w:pStyle w:val="ListNumber"/>
+        <w:numPr>
+          <w:ilvl w:val="0"/>
+          <w:numId w:val="13"/>
+        </w:numPr>
+      </w:pPr>
+      <w:r>
+        <w:t>Seal the top and bottom edges with foil tape.</w:t>
+      </w:r>
+    </w:p>
+    <w:p>
+      <w:pPr>
+        <w:keepNext/>
+        <w:spacing w:after="60"/>
+        <w:jc w:val="center"/>
+      </w:pPr>
+      <w:r>
+        <w:rPr>
+          <w:noProof/>
+        </w:rPr>
+        <w:drawing>
+          <wp:inline distT="0" distB="0" distL="0" distR="0" wp14:anchorId="4209CA87" wp14:editId="0CAB6F3E">
+            <wp:extent cx="3701570" cy="4572000"/>
+            <wp:effectExtent l="0" t="0" r="0" b="0"/>
+            <wp:docPr id="3" name="Picture 3" descr="Figure 4. Alternate large and small panels, then tape the adjoining edges."/>
+            <wp:cNvGraphicFramePr>
+              <a:graphicFrameLocks xmlns:a="http://schemas.openxmlformats.org/drawingml/2006/main" noChangeAspect="1"/>
+            </wp:cNvGraphicFramePr>
+            <a:graphic xmlns:a="http://schemas.openxmlformats.org/drawingml/2006/main">
+              <a:graphicData uri="http://schemas.openxmlformats.org/drawingml/2006/picture">
+                <pic:pic xmlns:pic="http://schemas.openxmlformats.org/drawingml/2006/picture">
+                  <pic:nvPicPr>
+                    <pic:cNvPr id="0" name="panel-order.png"/>
+                    <pic:cNvPicPr/>
+                  </pic:nvPicPr>
+                  <pic:blipFill>
+                    <a:blip r:embed="rId11"/>
+                    <a:stretch>
+                      <a:fillRect/>
+                    </a:stretch>
+                  </pic:blipFill>
+                  <pic:spPr>
+                    <a:xfrm>
+                      <a:off x="0" y="0"/>
+                      <a:ext cx="3701570" cy="4572000"/>
+                    </a:xfrm>
+                    <a:prstGeom prst="rect">
+                      <a:avLst/>
+                    </a:prstGeom>
+                  </pic:spPr>
+                </pic:pic>
+              </a:graphicData>
+            </a:graphic>
+          </wp:inline>
+        </w:drawing>
+      </w:r>
+    </w:p>
+    <w:p>
+      <w:pPr>
+        <w:pStyle w:val="Caption"/>
+        <w:jc w:val="center"/>
+      </w:pPr>
+      <w:r>
+        <w:t>Figure 4. Alternate large and small panels, then tape the adjoining edges.</w:t>
       </w:r>
     </w:p>
     <w:p>
@@ -782,7 +1453,7 @@
                     <pic:cNvPicPr/>
                   </pic:nvPicPr>
                   <pic:blipFill>
-                    <a:blip r:embed="rId11"/>
+                    <a:blip r:embed="rId12"/>
                     <a:stretch>
                       <a:fillRect/>
                     </a:stretch>
@@ -825,7 +1496,7 @@
                     <pic:cNvPicPr/>
                   </pic:nvPicPr>
                   <pic:blipFill>
-                    <a:blip r:embed="rId12"/>
+                    <a:blip r:embed="rId13"/>
                     <a:stretch>
                       <a:fillRect/>
                     </a:stretch>
@@ -868,7 +1539,7 @@
                     <pic:cNvPicPr/>
                   </pic:nvPicPr>
                   <pic:blipFill>
-                    <a:blip r:embed="rId13"/>
+                    <a:blip r:embed="rId14"/>
                     <a:stretch>
                       <a:fillRect/>
                     </a:stretch>
@@ -895,7 +1566,7 @@
         <w:jc w:val="center"/>
       </w:pPr>
       <w:r>
-        <w:t>Figure 4. Probe, drilled can, and attached feedthrough, from left to right.</w:t>
+        <w:t>Figure 5. Probe, drilled can, and attached feedthrough, from left to right.</w:t>
       </w:r>
     </w:p>
     <w:p>
@@ -934,7 +1605,7 @@
         </w:numPr>
       </w:pPr>
       <w:r>
-        <w:t>Place the horn upside down. Tape the flashing pieces to the horn, as shown at left in Figure 5.</w:t>
+        <w:t>Place the horn upside down. Tape the flashing pieces to the horn, as shown at left in Figure 6.</w:t>
       </w:r>
     </w:p>
     <w:p>
@@ -999,7 +1670,7 @@
                     <pic:cNvPicPr/>
                   </pic:nvPicPr>
                   <pic:blipFill>
-                    <a:blip r:embed="rId14"/>
+                    <a:blip r:embed="rId15"/>
                     <a:stretch>
                       <a:fillRect/>
                     </a:stretch>
@@ -1042,7 +1713,7 @@
                     <pic:cNvPicPr/>
                   </pic:nvPicPr>
                   <pic:blipFill>
-                    <a:blip r:embed="rId15"/>
+                    <a:blip r:embed="rId16"/>
                     <a:stretch>
                       <a:fillRect/>
                     </a:stretch>
@@ -1069,7 +1740,7 @@
         <w:jc w:val="center"/>
       </w:pPr>
       <w:r>
-        <w:t>Figure 5. Flashing before and after attaching the can.</w:t>
+        <w:t>Figure 6. Flashing before and after attaching the can.</w:t>
       </w:r>
     </w:p>
     <w:p>
@@ -1098,7 +1769,7 @@
                     <pic:cNvPicPr/>
                   </pic:nvPicPr>
                   <pic:blipFill>
-                    <a:blip r:embed="rId16"/>
+                    <a:blip r:embed="rId17"/>
                     <a:stretch>
                       <a:fillRect/>
                     </a:stretch>
@@ -1125,16 +1796,16 @@
         <w:jc w:val="center"/>
       </w:pPr>
       <w:r>
-        <w:t>Figure 6. Interior seams fully covered with foil tape.</w:t>
+        <w:t>Figure 7. Interior seams fully covered with foil tape.</w:t>
       </w:r>
     </w:p>
     <w:sectPr>
-      <w:headerReference w:type="even" r:id="rId17"/>
-      <w:headerReference w:type="default" r:id="rId18"/>
-      <w:footerReference w:type="even" r:id="rId19"/>
-      <w:footerReference w:type="default" r:id="rId20"/>
-      <w:headerReference w:type="first" r:id="rId21"/>
-      <w:footerReference w:type="first" r:id="rId22"/>
+      <w:headerReference w:type="even" r:id="rId18"/>
+      <w:headerReference w:type="default" r:id="rId19"/>
+      <w:footerReference w:type="even" r:id="rId20"/>
+      <w:footerReference w:type="default" r:id="rId21"/>
+      <w:headerReference w:type="first" r:id="rId22"/>
+      <w:footerReference w:type="first" r:id="rId23"/>
       <w:pgSz w:w="12240" w:h="15840"/>
       <w:pgMar w:top="1512" w:right="1080" w:bottom="1008" w:left="1080" w:header="432" w:footer="432" w:gutter="0"/>
       <w:cols w:space="720"/>
@@ -1528,6 +2199,18 @@
     </w:lvlOverride>
   </w:num>
   <w:num w:numId="11" w16cid:durableId="1136489146">
+    <w:abstractNumId w:val="7"/>
+    <w:lvlOverride w:ilvl="0">
+      <w:startOverride w:val="1"/>
+    </w:lvlOverride>
+  </w:num>
+  <w:num w:numId="12" w16cid:durableId="595788459">
+    <w:abstractNumId w:val="7"/>
+    <w:lvlOverride w:ilvl="0">
+      <w:startOverride w:val="1"/>
+    </w:lvlOverride>
+  </w:num>
+  <w:num w:numId="13" w16cid:durableId="1716155435">
     <w:abstractNumId w:val="7"/>
     <w:lvlOverride w:ilvl="0">
       <w:startOverride w:val="1"/>

</xml_diff>